<commit_message>
Report: teacher name filled, page border on all pages, cover Roll No. replaced with blank Board Reg. No.
</commit_message>
<xml_diff>
--- a/Project_Report_Kadal_Kanakku.docx
+++ b/Project_Report_Kadal_Kanakku.docx
@@ -430,7 +430,7 @@
             <w14:bevel/>
           </w14:textOutline>
         </w:rPr>
-        <w:t xml:space="preserve">Roll No.  :  14</w:t>
+        <w:t xml:space="preserve">Board Reg. No. :  ____________________</w:t>
       </w:r>
     </w:p>
     <w:p>
@@ -807,7 +807,7 @@
             <w14:bevel/>
           </w14:textOutline>
         </w:rPr>
-        <w:t xml:space="preserve">____________________</w:t>
+        <w:t xml:space="preserve"> Varsha Priya Dharshni J</w:t>
       </w:r>
       <w:r>
         <w:rPr>
@@ -1513,7 +1513,7 @@
             <w14:bevel/>
           </w14:textOutline>
         </w:rPr>
-        <w:t xml:space="preserve">____________________</w:t>
+        <w:t xml:space="preserve"> Varsha Priya Dharshni J</w:t>
       </w:r>
       <w:r>
         <w:rPr>
@@ -1687,6 +1687,12 @@
         <w:sectPr>
           <w:pgSz w:w="11906" w:h="16838"/>
           <w:pgMar w:top="1440" w:right="1440" w:bottom="1440" w:left="1440" w:header="708" w:footer="708" w:gutter="0"/>
+          <w:pgBorders w:offsetFrom="page">
+            <w:top w:val="single" w:sz="12" w:space="24" w:color="000000"/>
+            <w:left w:val="single" w:sz="12" w:space="24" w:color="000000"/>
+            <w:bottom w:val="single" w:sz="12" w:space="24" w:color="000000"/>
+            <w:right w:val="single" w:sz="12" w:space="24" w:color="000000"/>
+          </w:pgBorders>
           <w:cols w:space="708"/>
           <w:docGrid w:linePitch="360"/>
         </w:sectPr>
@@ -20864,6 +20870,12 @@
     <w:sectPr>
       <w:pgSz w:w="11906" w:h="16838"/>
       <w:pgMar w:top="1440" w:right="1247" w:bottom="1440" w:left="1247" w:header="708" w:footer="708" w:gutter="0"/>
+      <w:pgBorders w:offsetFrom="page">
+        <w:top w:val="single" w:sz="12" w:space="24" w:color="000000"/>
+        <w:left w:val="single" w:sz="12" w:space="24" w:color="000000"/>
+        <w:bottom w:val="single" w:sz="12" w:space="24" w:color="000000"/>
+        <w:right w:val="single" w:sz="12" w:space="24" w:color="000000"/>
+      </w:pgBorders>
       <w:cols w:space="708"/>
       <w:docGrid w:linePitch="360"/>
     </w:sectPr>

</xml_diff>

<commit_message>
Use student name 'Ryan' in report and project files
</commit_message>
<xml_diff>
--- a/Project_Report_Kadal_Kanakku.docx
+++ b/Project_Report_Kadal_Kanakku.docx
@@ -306,7 +306,7 @@
             <w14:bevel/>
           </w14:textOutline>
         </w:rPr>
-        <w:t xml:space="preserve">Ryan Editraj</w:t>
+        <w:t xml:space="preserve">Ryan</w:t>
       </w:r>
       <w:r>
         <w:rPr>
@@ -650,7 +650,7 @@
             <w14:bevel/>
           </w14:textOutline>
         </w:rPr>
-        <w:t xml:space="preserve">Ryan Editraj</w:t>
+        <w:t xml:space="preserve">Ryan</w:t>
       </w:r>
       <w:r>
         <w:rPr>
@@ -1327,7 +1327,7 @@
             <w14:bevel/>
           </w14:textOutline>
         </w:rPr>
-        <w:t xml:space="preserve">Ryan Editraj </w:t>
+        <w:t xml:space="preserve">Ryan, </w:t>
       </w:r>
       <w:r>
         <w:rPr>
@@ -3885,7 +3885,7 @@
           <w:rFonts w:ascii="Courier New" w:hAnsi="Courier New"/>
           <w:sz w:val="16"/>
         </w:rPr>
-        <w:t>--  Ryan Editraj, XII A</w:t>
+        <w:t>--  Ryan, XII A</w:t>
       </w:r>
     </w:p>
     <w:p>
@@ -5633,7 +5633,7 @@
           <w:rFonts w:ascii="Courier New" w:hAnsi="Courier New"/>
           <w:sz w:val="16"/>
         </w:rPr>
-        <w:t>#  Student : Ryan Editraj, XII A, Roll No. 14</w:t>
+        <w:t>#  Student : Ryan, XII A, Roll No. 14</w:t>
       </w:r>
     </w:p>
     <w:p>

</xml_diff>